<commit_message>
new changes lat and long
</commit_message>
<xml_diff>
--- a/Backend/Templates/PaySlipTemplate.docx
+++ b/Backend/Templates/PaySlipTemplate.docx
@@ -1721,14 +1721,16 @@
                 <w:szCs w:val="18"/>
               </w:rPr>
             </w:pPr>
-            <w:r>
-              <w:rPr>
-                <w:rFonts w:ascii="Arial" w:hAnsi="Arial" w:cs="Arial"/>
-                <w:sz w:val="18"/>
-                <w:szCs w:val="18"/>
-              </w:rPr>
-              <w:t>Other Deductions</w:t>
-            </w:r>
+            <w:bookmarkStart w:id="23" w:name="DeductionType"/>
+            <w:r>
+              <w:rPr>
+                <w:rFonts w:ascii="Arial" w:hAnsi="Arial" w:cs="Arial"/>
+                <w:sz w:val="18"/>
+                <w:szCs w:val="18"/>
+              </w:rPr>
+              <w:t>XX</w:t>
+            </w:r>
+            <w:bookmarkEnd w:id="23"/>
           </w:p>
         </w:tc>
         <w:tc>
@@ -1751,7 +1753,7 @@
                 <w:szCs w:val="18"/>
               </w:rPr>
             </w:pPr>
-            <w:bookmarkStart w:id="23" w:name="OtherDeduction"/>
+            <w:bookmarkStart w:id="24" w:name="OtherDeduction"/>
             <w:r>
               <w:rPr>
                 <w:rFonts w:ascii="Arial" w:hAnsi="Arial" w:cs="Arial"/>
@@ -1760,7 +1762,7 @@
               </w:rPr>
               <w:t>00</w:t>
             </w:r>
-            <w:bookmarkEnd w:id="23"/>
+            <w:bookmarkEnd w:id="24"/>
           </w:p>
         </w:tc>
       </w:tr>
@@ -1818,7 +1820,7 @@
                 <w:szCs w:val="18"/>
               </w:rPr>
             </w:pPr>
-            <w:bookmarkStart w:id="24" w:name="Medical"/>
+            <w:bookmarkStart w:id="25" w:name="Medical"/>
             <w:r>
               <w:rPr>
                 <w:rFonts w:ascii="Arial" w:hAnsi="Arial" w:cs="Arial"/>
@@ -1827,7 +1829,7 @@
               </w:rPr>
               <w:t>00</w:t>
             </w:r>
-            <w:bookmarkEnd w:id="24"/>
+            <w:bookmarkEnd w:id="25"/>
           </w:p>
         </w:tc>
         <w:tc>
@@ -1928,7 +1930,7 @@
                 <w:szCs w:val="18"/>
               </w:rPr>
             </w:pPr>
-            <w:bookmarkStart w:id="25" w:name="Special"/>
+            <w:bookmarkStart w:id="26" w:name="Special"/>
             <w:r>
               <w:rPr>
                 <w:rFonts w:ascii="Arial" w:hAnsi="Arial" w:cs="Arial"/>
@@ -1937,7 +1939,7 @@
               </w:rPr>
               <w:t>00</w:t>
             </w:r>
-            <w:bookmarkEnd w:id="25"/>
+            <w:bookmarkEnd w:id="26"/>
           </w:p>
         </w:tc>
         <w:tc>
@@ -2216,7 +2218,7 @@
                 <w:szCs w:val="18"/>
               </w:rPr>
             </w:pPr>
-            <w:bookmarkStart w:id="26" w:name="TotalEarnings"/>
+            <w:bookmarkStart w:id="27" w:name="TotalEarnings"/>
             <w:r>
               <w:rPr>
                 <w:rFonts w:ascii="Arial" w:hAnsi="Arial" w:cs="Arial"/>
@@ -2225,7 +2227,7 @@
               </w:rPr>
               <w:t>00</w:t>
             </w:r>
-            <w:bookmarkEnd w:id="26"/>
+            <w:bookmarkEnd w:id="27"/>
           </w:p>
         </w:tc>
         <w:tc>
@@ -2280,7 +2282,7 @@
                 <w:szCs w:val="18"/>
               </w:rPr>
             </w:pPr>
-            <w:bookmarkStart w:id="27" w:name="TotalDeduction"/>
+            <w:bookmarkStart w:id="28" w:name="TotalDeduction"/>
             <w:r>
               <w:rPr>
                 <w:rFonts w:ascii="Arial" w:hAnsi="Arial" w:cs="Arial"/>
@@ -2289,7 +2291,7 @@
               </w:rPr>
               <w:t>00</w:t>
             </w:r>
-            <w:bookmarkEnd w:id="27"/>
+            <w:bookmarkEnd w:id="28"/>
           </w:p>
         </w:tc>
       </w:tr>
@@ -2353,7 +2355,7 @@
                 <w:szCs w:val="18"/>
               </w:rPr>
             </w:pPr>
-            <w:bookmarkStart w:id="28" w:name="NetSalary"/>
+            <w:bookmarkStart w:id="29" w:name="NetSalary"/>
             <w:r>
               <w:rPr>
                 <w:rFonts w:ascii="Arial" w:hAnsi="Arial" w:cs="Arial"/>
@@ -2362,7 +2364,7 @@
               </w:rPr>
               <w:t>00</w:t>
             </w:r>
-            <w:bookmarkEnd w:id="28"/>
+            <w:bookmarkEnd w:id="29"/>
           </w:p>
         </w:tc>
       </w:tr>
@@ -2433,7 +2435,7 @@
               </w:rPr>
               <w:t xml:space="preserve">Rupees </w:t>
             </w:r>
-            <w:bookmarkStart w:id="29" w:name="InWords"/>
+            <w:bookmarkStart w:id="30" w:name="InWords"/>
             <w:r>
               <w:rPr>
                 <w:rFonts w:ascii="Arial" w:hAnsi="Arial" w:cs="Arial"/>
@@ -2442,7 +2444,7 @@
               </w:rPr>
               <w:t>xx</w:t>
             </w:r>
-            <w:bookmarkEnd w:id="29"/>
+            <w:bookmarkEnd w:id="30"/>
           </w:p>
         </w:tc>
       </w:tr>

</xml_diff>